<commit_message>
Report v2: <the actual edit>
</commit_message>
<xml_diff>
--- a/comms/report/Stage1_Report_M1_v2.docx
+++ b/comms/report/Stage1_Report_M1_v2.docx
@@ -157,7 +157,23 @@
         <w:jc w:val="both"/>
       </w:pPr>
       <w:r>
-        <w:t>Electric cable shovels lose on the order of US$100,000 per hour when unavailable, yet their internal condition is not directly measurable: motor signals mix the effects of motion, external load, and machine health into a single reading. This programme separates those effects by subtracting exact rigid-body physics from measured drive torque, leaving a residual that carries load and condition information. This report documents the programme's foundation (Milestone M1): a two-degree-of-freedom Euler–Lagrange model of a P&amp;H-class cable shovel dipper–handle subsystem — saddle rotation and crowd extension — validated against an independently constructed Simscape multibody simulation acting as a numerical oracle. With joint accelerations sensed rather than numerically differentiated, both derived equations reproduce the oracle to machine precision (R² = 1.000000; residuals at the 10⁻¹³ level against MN·m-scale signals), and blind least-squares identification recovers all five model parameters exactly, with a correctly identified null for the deliberately excluded Coulomb term. A controlled comparison shows that numerical differentiation of encoder velocities biases the identified inertia by 56%, establishing sensed or observer-based acceleration as a hard instrumentation requirement for the field phase. The validated model now serves as the exact subtraction reference for the load-observer programme: Milestone M2 requires recovery of a known injected dipper force to within 2–3% NRMSE, the first demonstration of the diagnostic channel this programme exists to build.</w:t>
+        <w:t xml:space="preserve">Electric cable shovels lose on the order of US$100,000 per hour when unavailable, yet their internal condition is not directly measurable: motor signals mix the effects of motion, external load, and machine health into a single reading. This programme separates those effects by subtracting exact rigid-body physics from measured drive torque, leaving a residual that carries load and condition information. This report documents the programme's foundation (Milestone M1): a two-degree-of-freedom Euler–Lagrange model of a P&amp;H-class cable shovel dipper–handle subsystem — saddle rotation and crowd extension — validated against an independently constructed </w:t>
+      </w:r>
+      <w:proofErr w:type="spellStart"/>
+      <w:r>
+        <w:t>Simscape</w:t>
+      </w:r>
+      <w:proofErr w:type="spellEnd"/>
+      <w:r>
+        <w:t xml:space="preserve"> multibody simulation acting as a numerical oracle. With joint accelerations sensed rather than numerically differentiated, both derived equations reproduce the oracle to machine precision (R² = 1.000000; residuals at the 10⁻¹³ level against </w:t>
+      </w:r>
+      <w:proofErr w:type="spellStart"/>
+      <w:r>
+        <w:t>MN·m-scale</w:t>
+      </w:r>
+      <w:proofErr w:type="spellEnd"/>
+      <w:r>
+        <w:t xml:space="preserve"> signals), and blind least-squares identification recovers all five model parameters exactly, with a correctly identified null for the deliberately excluded Coulomb term. A controlled comparison shows that numerical differentiation of encoder velocities biases the identified inertia by 56%, establishing sensed or observer-based acceleration as a hard instrumentation requirement for the field phase. The validated model now serves as the exact subtraction reference for the load-observer programme: Milestone M2 requires recovery of a known injected dipper force to within 2–3% NRMSE, the first demonstration of the diagnostic channel this programme exists to build.</w:t>
       </w:r>
     </w:p>
     <w:p>
@@ -2049,7 +2065,23 @@
           <w:sz w:val="20"/>
           <w:szCs w:val="20"/>
         </w:rPr>
-        <w:t>Symbol correspondence with [1]: Rasuli writes joint angles θᵢ and collects parameters in Φ; this report writes coordinates q and collects parameters in θ. The symbol tables differ; the physics is identical.</w:t>
+        <w:t xml:space="preserve">Symbol correspondence with [1]: </w:t>
+      </w:r>
+      <w:proofErr w:type="spellStart"/>
+      <w:r>
+        <w:rPr>
+          <w:sz w:val="20"/>
+          <w:szCs w:val="20"/>
+        </w:rPr>
+        <w:t>Rasuli</w:t>
+      </w:r>
+      <w:proofErr w:type="spellEnd"/>
+      <w:r>
+        <w:rPr>
+          <w:sz w:val="20"/>
+          <w:szCs w:val="20"/>
+        </w:rPr>
+        <w:t xml:space="preserve"> writes joint angles θᵢ and collects parameters in Φ; this report writes coordinates q and collects parameters in θ. The symbol tables differ; the physics is identical.</w:t>
       </w:r>
     </w:p>
     <w:tbl>
@@ -2363,6 +2395,7 @@
             </w:tcMar>
           </w:tcPr>
           <w:p>
+            <w:proofErr w:type="spellStart"/>
             <w:r>
               <w:rPr>
                 <w:rFonts w:ascii="Cambria Math" w:eastAsia="Cambria Math" w:hAnsi="Cambria Math" w:cs="Cambria Math"/>
@@ -2384,6 +2417,7 @@
               </w:rPr>
               <w:t>zz</w:t>
             </w:r>
+            <w:proofErr w:type="spellEnd"/>
           </w:p>
         </w:tc>
         <w:tc>
@@ -2645,13 +2679,31 @@
             </w:tcMar>
           </w:tcPr>
           <w:p>
-            <w:r>
-              <w:rPr>
-                <w:sz w:val="19"/>
-                <w:szCs w:val="19"/>
-              </w:rPr>
-              <w:t>N·m·s/rad, N·m</w:t>
-            </w:r>
+            <w:proofErr w:type="spellStart"/>
+            <w:r>
+              <w:rPr>
+                <w:sz w:val="19"/>
+                <w:szCs w:val="19"/>
+              </w:rPr>
+              <w:t>N·m·s</w:t>
+            </w:r>
+            <w:proofErr w:type="spellEnd"/>
+            <w:r>
+              <w:rPr>
+                <w:sz w:val="19"/>
+                <w:szCs w:val="19"/>
+              </w:rPr>
+              <w:t xml:space="preserve">/rad, </w:t>
+            </w:r>
+            <w:proofErr w:type="spellStart"/>
+            <w:r>
+              <w:rPr>
+                <w:sz w:val="19"/>
+                <w:szCs w:val="19"/>
+              </w:rPr>
+              <w:t>N·m</w:t>
+            </w:r>
+            <w:proofErr w:type="spellEnd"/>
           </w:p>
         </w:tc>
       </w:tr>
@@ -2915,6 +2967,7 @@
             </w:tcMar>
           </w:tcPr>
           <w:p>
+            <w:proofErr w:type="spellStart"/>
             <w:r>
               <w:rPr>
                 <w:sz w:val="19"/>
@@ -2922,6 +2975,7 @@
               </w:rPr>
               <w:t>N·m</w:t>
             </w:r>
+            <w:proofErr w:type="spellEnd"/>
           </w:p>
         </w:tc>
       </w:tr>
@@ -3185,6 +3239,7 @@
             </w:tcMar>
           </w:tcPr>
           <w:p>
+            <w:proofErr w:type="spellStart"/>
             <w:r>
               <w:rPr>
                 <w:rFonts w:ascii="Cambria Math" w:eastAsia="Cambria Math" w:hAnsi="Cambria Math" w:cs="Cambria Math"/>
@@ -3206,6 +3261,7 @@
               </w:rPr>
               <w:t>load</w:t>
             </w:r>
+            <w:proofErr w:type="spellEnd"/>
           </w:p>
         </w:tc>
         <w:tc>
@@ -3239,6 +3295,7 @@
             </w:tcMar>
           </w:tcPr>
           <w:p>
+            <w:proofErr w:type="spellStart"/>
             <w:r>
               <w:rPr>
                 <w:sz w:val="19"/>
@@ -3246,6 +3303,7 @@
               </w:rPr>
               <w:t>N·m</w:t>
             </w:r>
+            <w:proofErr w:type="spellEnd"/>
           </w:p>
         </w:tc>
       </w:tr>
@@ -3271,7 +3329,15 @@
         <w:jc w:val="both"/>
       </w:pPr>
       <w:r>
-        <w:t>An electric cable shovel is the single most production-critical machine in a large open-pit mine: when a production cable shovel stops, the truck fleet behind it stops, at a cost Rasuli documents at more than US$100,000 per hour of normal operation [2] — his own field campaign interrupted production for roughly eight hours across four days, itself an argument for estimation methods that work from normal-operation data. Health monitoring and payload measurement are therefore decisive economics, not instrumentation luxuries. Yet the machine's internal condition cannot be measured directly. The signals that exist — motor currents, voltages, and speeds already present in the drive system — mix three causes into every reading: the commanded motion, the external load on the dipper, and the mechanical condition of the machine. A rising hoist current may mean a heavier pass, a change in operator style, or a bearing beginning to fail; the current alone cannot say which.</w:t>
+        <w:t xml:space="preserve">An electric cable shovel is the single most production-critical machine in a large open-pit mine: when a production cable shovel stops, the truck fleet behind it stops, at a cost </w:t>
+      </w:r>
+      <w:proofErr w:type="spellStart"/>
+      <w:r>
+        <w:t>Rasuli</w:t>
+      </w:r>
+      <w:proofErr w:type="spellEnd"/>
+      <w:r>
+        <w:t xml:space="preserve"> documents at more than US$100,000 per hour of normal operation [2] — his own field campaign interrupted production for roughly eight hours across four days, itself an argument for estimation methods that work from normal-operation data. Health monitoring and payload measurement are therefore decisive economics, not instrumentation luxuries. Yet the machine's internal condition cannot be measured directly. The signals that exist — motor currents, voltages, and speeds already present in the drive system — mix three causes into every reading: the commanded motion, the external load on the dipper, and the mechanical condition of the machine. A rising hoist current may mean a heavier pass, a change in operator style, or a bearing beginning to fail; the current alone cannot say which.</w:t>
       </w:r>
     </w:p>
     <w:p>
@@ -3279,8 +3345,21 @@
         <w:spacing w:after="170" w:line="288" w:lineRule="auto"/>
         <w:jc w:val="both"/>
       </w:pPr>
-      <w:r>
-        <w:t>Rasuli, Tafazoli and Dunford [1] demonstrated the enabling half of the solution: motor signals encode the full dynamic state of the shovel, sufficient to identify its inertial and friction parameters and to estimate payload. But their estimator explicitly excludes the digging cycle, because during digging an unmeasurable external force acts on the dipper — precisely the phase in which faults are loaded, payload is acquired, and monitoring matters most. The estimator is blind exactly where the machine lives.</w:t>
+      <w:proofErr w:type="spellStart"/>
+      <w:r>
+        <w:t>Rasuli</w:t>
+      </w:r>
+      <w:proofErr w:type="spellEnd"/>
+      <w:r>
+        <w:t xml:space="preserve">, </w:t>
+      </w:r>
+      <w:proofErr w:type="spellStart"/>
+      <w:r>
+        <w:t>Tafazoli</w:t>
+      </w:r>
+      <w:proofErr w:type="spellEnd"/>
+      <w:r>
+        <w:t xml:space="preserve"> and Dunford [1] demonstrated the enabling half of the solution: motor signals encode the full dynamic state of the shovel, sufficient to identify its inertial and friction parameters and to estimate payload. But their estimator explicitly excludes the digging cycle, because during digging an unmeasurable external force acts on the dipper — precisely the phase in which faults are loaded, payload is acquired, and monitoring matters most. The estimator is blind exactly where the machine lives.</w:t>
       </w:r>
     </w:p>
     <w:p>
@@ -3365,6 +3444,7 @@
       <w:r>
         <w:t xml:space="preserve">Everything in this programme depends on the subtracted model being exact — an error in </w:t>
       </w:r>
+      <w:proofErr w:type="spellStart"/>
       <w:r>
         <w:rPr>
           <w:rFonts w:ascii="Cambria Math" w:eastAsia="Cambria Math" w:hAnsi="Cambria Math" w:cs="Cambria Math"/>
@@ -3383,8 +3463,13 @@
         <w:t>mode</w:t>
       </w:r>
       <w:r>
-        <w:t xml:space="preserve">l appears in </w:t>
-      </w:r>
+        <w:t>l</w:t>
+      </w:r>
+      <w:proofErr w:type="spellEnd"/>
+      <w:r>
+        <w:t xml:space="preserve"> appears in </w:t>
+      </w:r>
+      <w:proofErr w:type="spellStart"/>
       <w:r>
         <w:rPr>
           <w:rFonts w:ascii="Cambria Math" w:eastAsia="Cambria Math" w:hAnsi="Cambria Math" w:cs="Cambria Math"/>
@@ -3402,6 +3487,7 @@
         </w:rPr>
         <w:t>load</w:t>
       </w:r>
+      <w:proofErr w:type="spellEnd"/>
       <w:r>
         <w:t xml:space="preserve"> disguised as load or as fault. This report documents the construction and verification of that foundation, Milestone M1: a two-degree-of-freedom dynamic model of the dipper–handle subsystem, validated to machine precision against an independent multibody simulation, with all parameters recovered blind from simulated data. Sections 2–4 present the model, the verification methodology, and the identification machinery; Section 5 reports the results; Section 6 states the honest limits of what has been proven and the path from here to a field-deployable health monitor — the promise this report exists to underwrite.</w:t>
       </w:r>
@@ -3421,8 +3507,13 @@
         <w:pStyle w:val="Heading2"/>
       </w:pPr>
       <w:bookmarkStart w:id="5" w:name="_Toc235803509"/>
-      <w:r>
-        <w:t>2.1  Abstraction: the 2-DOF dipper–handle subsystem</w:t>
+      <w:proofErr w:type="gramStart"/>
+      <w:r>
+        <w:t>2.1  Abstraction</w:t>
+      </w:r>
+      <w:proofErr w:type="gramEnd"/>
+      <w:r>
+        <w:t>: the 2-DOF dipper–handle subsystem</w:t>
       </w:r>
       <w:bookmarkEnd w:id="5"/>
     </w:p>
@@ -3432,7 +3523,15 @@
         <w:jc w:val="both"/>
       </w:pPr>
       <w:r>
-        <w:t>The cable shovel is abstracted to the smallest subsystem that contains every class of term the full machine will exhibit: the dipper–handle assembly, moving in the saddle rotation q₃ (revolute) and the crowd extension d₄ (prismatic). Swing, hoist-rope actuation, and boom compliance enter at later milestones (M5–M6); the boom is passive geometry at this stage. The decisive geometric feature is the time-varying lever arm: the assembly's centre of gravity sits at distance r = d₄ + c from the saddle pivot, with c = −1.32 m the constant offset composed of the pivot-to-handle transform and the COG position, so extending the crowd genuinely changes the plant — its inertia about the pivot, its gravity moment, and its velocity coupling. One coordinate convention differs from the source: Rasuli measures d₄ from the saddle pivot itself (his crowd and saddle frames coincide by his stated assumption a₃ = 0), whereas this model measures d₄ from a datum 1.5 m along the handle; the two coordinates differ by that constant, only the lever arm r is physical, and the offset is absorbed exactly into the identified c.</w:t>
+        <w:t xml:space="preserve">The cable shovel is abstracted to the smallest subsystem that contains every class of term the full machine will exhibit: the dipper–handle assembly, moving in the saddle rotation q₃ (revolute) and the crowd extension d₄ (prismatic). Swing, hoist-rope actuation, and boom compliance enter at later milestones (M5–M6); the boom is passive geometry at this stage. The decisive geometric feature is the time-varying lever arm: the assembly's centre of gravity sits at distance r = d₄ + c from the saddle pivot, with c = −1.32 m the constant offset composed of the pivot-to-handle transform and the COG position, so extending the crowd genuinely changes the plant — its inertia about the pivot, its gravity moment, and its velocity coupling. One coordinate convention differs from the source: </w:t>
+      </w:r>
+      <w:proofErr w:type="spellStart"/>
+      <w:r>
+        <w:t>Rasuli</w:t>
+      </w:r>
+      <w:proofErr w:type="spellEnd"/>
+      <w:r>
+        <w:t xml:space="preserve"> measures d₄ from the saddle pivot itself (his crowd and saddle frames coincide by his stated assumption a₃ = 0), whereas this model measures d₄ from a datum 1.5 m along the handle; the two coordinates differ by that constant, only the lever arm r is physical, and the offset is absorbed exactly into the identified c.</w:t>
       </w:r>
     </w:p>
     <w:p>
@@ -3445,10 +3544,10 @@
           <w:noProof/>
         </w:rPr>
         <w:drawing>
-          <wp:inline distT="0" distB="0" distL="0" distR="0" wp14:anchorId="3A35C697" wp14:editId="77B081E5">
-            <wp:extent cx="12624842" cy="6659894"/>
-            <wp:effectExtent l="0" t="0" r="5715" b="7620"/>
-            <wp:docPr id="25" name="Picture 25"/>
+          <wp:inline distT="0" distB="0" distL="0" distR="0" wp14:anchorId="71B666B4" wp14:editId="7A3A155C">
+            <wp:extent cx="10363200" cy="6659880"/>
+            <wp:effectExtent l="0" t="0" r="0" b="7620"/>
+            <wp:docPr id="2" name="Picture 2"/>
             <wp:cNvGraphicFramePr>
               <a:graphicFrameLocks xmlns:a="http://schemas.openxmlformats.org/drawingml/2006/main" noChangeAspect="1"/>
             </wp:cNvGraphicFramePr>
@@ -3456,7 +3555,7 @@
               <a:graphicData uri="http://schemas.openxmlformats.org/drawingml/2006/picture">
                 <pic:pic xmlns:pic="http://schemas.openxmlformats.org/drawingml/2006/picture">
                   <pic:nvPicPr>
-                    <pic:cNvPr id="25" name="Picture 25"/>
+                    <pic:cNvPr id="2" name="Picture 2"/>
                     <pic:cNvPicPr/>
                   </pic:nvPicPr>
                   <pic:blipFill>
@@ -3474,7 +3573,7 @@
                   <pic:spPr>
                     <a:xfrm>
                       <a:off x="0" y="0"/>
-                      <a:ext cx="12624842" cy="6659894"/>
+                      <a:ext cx="10363225" cy="6659896"/>
                     </a:xfrm>
                     <a:prstGeom prst="rect">
                       <a:avLst/>
@@ -3508,8 +3607,13 @@
         <w:pStyle w:val="Heading2"/>
       </w:pPr>
       <w:bookmarkStart w:id="6" w:name="_Toc235803510"/>
-      <w:r>
-        <w:t>2.2  Equations of motion</w:t>
+      <w:proofErr w:type="gramStart"/>
+      <w:r>
+        <w:t>2.2  Equations</w:t>
+      </w:r>
+      <w:proofErr w:type="gramEnd"/>
+      <w:r>
+        <w:t xml:space="preserve"> of motion</w:t>
       </w:r>
       <w:bookmarkEnd w:id="6"/>
     </w:p>
@@ -3593,7 +3697,15 @@
         <w:jc w:val="both"/>
       </w:pPr>
       <w:r>
-        <w:t>Applying the operator to the Lagrangian of the assembly (full steps in Appendix A) yields the saddle equation,</w:t>
+        <w:t xml:space="preserve">Applying the operator to the </w:t>
+      </w:r>
+      <w:proofErr w:type="spellStart"/>
+      <w:r>
+        <w:t>Lagrangian</w:t>
+      </w:r>
+      <w:proofErr w:type="spellEnd"/>
+      <w:r>
+        <w:t xml:space="preserve"> of the assembly (full steps in Appendix A) yields the saddle equation,</w:t>
       </w:r>
     </w:p>
     <w:p>
@@ -3743,6 +3855,7 @@
       <w:r>
         <w:t>Each term has a physical reading. In Equation 3: (</w:t>
       </w:r>
+      <w:proofErr w:type="spellStart"/>
       <w:r>
         <w:rPr>
           <w:rFonts w:ascii="Cambria Math" w:eastAsia="Cambria Math" w:hAnsi="Cambria Math" w:cs="Cambria Math"/>
@@ -3760,6 +3873,7 @@
         </w:rPr>
         <w:t>zz</w:t>
       </w:r>
+      <w:proofErr w:type="spellEnd"/>
       <w:r>
         <w:t xml:space="preserve"> + </w:t>
       </w:r>
@@ -3881,7 +3995,20 @@
         <w:t>d</w:t>
       </w:r>
       <w:r>
-        <w:t xml:space="preserve"> g sin q₃ is the gravity component along the slide. In the manipulator form D(q)q̈ + C(q,q̇)q̇ + G(q) = τ, these equations inherit the structural properties (symmetric positive-definite D; skew-symmetric Ḋ − 2C) on which the Milestone-M3 momentum observer relies.</w:t>
+        <w:t xml:space="preserve"> g sin q₃ is the gravity component along the slide. In the manipulator form D(q)q̈ + C(</w:t>
+      </w:r>
+      <w:proofErr w:type="spellStart"/>
+      <w:proofErr w:type="gramStart"/>
+      <w:r>
+        <w:t>q,q</w:t>
+      </w:r>
+      <w:proofErr w:type="spellEnd"/>
+      <w:r>
+        <w:t>̇</w:t>
+      </w:r>
+      <w:proofErr w:type="gramEnd"/>
+      <w:r>
+        <w:t>)q̇ + G(q) = τ, these equations inherit the structural properties (symmetric positive-definite D; skew-symmetric Ḋ − 2C) on which the Milestone-M3 momentum observer relies.</w:t>
       </w:r>
     </w:p>
     <w:p>
@@ -3889,8 +4016,13 @@
         <w:pStyle w:val="Heading2"/>
       </w:pPr>
       <w:bookmarkStart w:id="7" w:name="_Toc235803511"/>
-      <w:r>
-        <w:t>2.3  Parameters and assumptions</w:t>
+      <w:proofErr w:type="gramStart"/>
+      <w:r>
+        <w:t>2.3  Parameters</w:t>
+      </w:r>
+      <w:proofErr w:type="gramEnd"/>
+      <w:r>
+        <w:t xml:space="preserve"> and assumptions</w:t>
       </w:r>
       <w:bookmarkEnd w:id="7"/>
     </w:p>
@@ -3900,7 +4032,15 @@
         <w:jc w:val="both"/>
       </w:pPr>
       <w:r>
-        <w:t xml:space="preserve">All physical parameters derive from Rasuli et al. [1], Table II (dynamic-identification case), identified on a P&amp;H 2100 production shovel; the model is therefore P&amp;H-class rather than model-specific. Values: </w:t>
+        <w:t xml:space="preserve">All physical parameters derive from </w:t>
+      </w:r>
+      <w:proofErr w:type="spellStart"/>
+      <w:r>
+        <w:t>Rasuli</w:t>
+      </w:r>
+      <w:proofErr w:type="spellEnd"/>
+      <w:r>
+        <w:t xml:space="preserve"> et al. [1], Table II (dynamic-identification case), identified on a P&amp;H 2100 production shovel; the model is therefore P&amp;H-class rather than model-specific. Values: </w:t>
       </w:r>
       <w:r>
         <w:rPr>
@@ -3920,7 +4060,11 @@
         <w:t>d</w:t>
       </w:r>
       <w:r>
-        <w:t xml:space="preserve"> = 54,300 kg; L</w:t>
+        <w:t xml:space="preserve"> = 54,300 kg; </w:t>
+      </w:r>
+      <w:proofErr w:type="spellStart"/>
+      <w:r>
+        <w:t>L</w:t>
       </w:r>
       <w:r>
         <w:rPr>
@@ -3928,9 +4072,11 @@
         </w:rPr>
         <w:t>COG_Offset</w:t>
       </w:r>
+      <w:proofErr w:type="spellEnd"/>
       <w:r>
         <w:t xml:space="preserve"> = 2.82 m; </w:t>
       </w:r>
+      <w:proofErr w:type="spellStart"/>
       <w:r>
         <w:rPr>
           <w:rFonts w:ascii="Cambria Math" w:eastAsia="Cambria Math" w:hAnsi="Cambria Math" w:cs="Cambria Math"/>
@@ -3948,6 +4094,7 @@
         </w:rPr>
         <w:t>zz</w:t>
       </w:r>
+      <w:proofErr w:type="spellEnd"/>
       <w:r>
         <w:t xml:space="preserve"> = 287,900 kg·m²; </w:t>
       </w:r>
@@ -3969,7 +4116,15 @@
         <w:t>v3</w:t>
       </w:r>
       <w:r>
-        <w:t xml:space="preserve"> = 3,800 N·m·s/rad; </w:t>
+        <w:t xml:space="preserve"> = 3,800 </w:t>
+      </w:r>
+      <w:proofErr w:type="spellStart"/>
+      <w:r>
+        <w:t>N·m·s</w:t>
+      </w:r>
+      <w:proofErr w:type="spellEnd"/>
+      <w:r>
+        <w:t xml:space="preserve">/rad; </w:t>
       </w:r>
       <w:r>
         <w:rPr>
@@ -3989,7 +4144,15 @@
         <w:t>v4</w:t>
       </w:r>
       <w:r>
-        <w:t xml:space="preserve"> = 1,473 N·s/m. They live in a single parameter file (shovel_params.m) read by both the simulation and the analysis — a construction adopted after duplicated constants were found to drift apart between files. The Stage-1 model is deliberately simplified, and each simplification is explicit: the mechanism is planar and rigid; friction is viscous only — the Coulomb coefficients on record in [1] (</w:t>
+        <w:t xml:space="preserve"> = 1,473 N·s/m. They live in a single parameter file (</w:t>
+      </w:r>
+      <w:proofErr w:type="spellStart"/>
+      <w:r>
+        <w:t>shovel_params.m</w:t>
+      </w:r>
+      <w:proofErr w:type="spellEnd"/>
+      <w:r>
+        <w:t>) read by both the simulation and the analysis — a construction adopted after duplicated constants were found to drift apart between files. The Stage-1 model is deliberately simplified, and each simplification is explicit: the mechanism is planar and rigid; friction is viscous only — the Coulomb coefficients on record in [1] (</w:t>
       </w:r>
       <w:r>
         <w:rPr>
@@ -4009,7 +4172,15 @@
         <w:t>c3</w:t>
       </w:r>
       <w:r>
-        <w:t xml:space="preserve"> = 340 N·m, </w:t>
+        <w:t xml:space="preserve"> = 340 </w:t>
+      </w:r>
+      <w:proofErr w:type="spellStart"/>
+      <w:r>
+        <w:t>N·m</w:t>
+      </w:r>
+      <w:proofErr w:type="spellEnd"/>
+      <w:r>
+        <w:t xml:space="preserve">, </w:t>
       </w:r>
       <w:r>
         <w:rPr>
@@ -4029,7 +4200,55 @@
         <w:t>c4</w:t>
       </w:r>
       <w:r>
-        <w:t xml:space="preserve"> = 480 N) are excluded because sgn(q̇) discontinuities interact badly with variable-step integration, and their absence gives the identification a negative control; no external force acts on the dipper; parameters are constant. Table 2 in Section 6 maps each assumption to the milestone that removes it. Two claims are therefore made precisely: the equations are exact for this abstraction, and the abstraction's boundary is documented. A symbol note on the source: the 2.82 m entry is headed LCOG_Offset in [1] (LCOGO in [2]) and is the along-axis distance from the assembly's centre of gravity to the perpendicular through the dipper bail (point E, which lies above the handle axis); Rasuli's own construction r_cd = d₄ − LCOG_Offset (eq. 56 of [2]) uses it exactly as this model does. The hoist and crowd motor constants reported in the same table, K_H = 1940 N/A and K_C = 3950 N/A, are recorded for the field phase (Milestone M5).</w:t>
+        <w:t xml:space="preserve"> = 480 N) are excluded because </w:t>
+      </w:r>
+      <w:proofErr w:type="spellStart"/>
+      <w:r>
+        <w:t>sgn</w:t>
+      </w:r>
+      <w:proofErr w:type="spellEnd"/>
+      <w:r>
+        <w:t xml:space="preserve">(q̇) discontinuities interact badly with variable-step integration, and their absence gives the identification a negative control; no external force acts on the dipper; parameters are constant. Table 2 in Section 6 maps each assumption to the milestone that removes it. Two claims are therefore made precisely: the equations are exact for this abstraction, and the abstraction's boundary is documented. A symbol </w:t>
+      </w:r>
+      <w:proofErr w:type="gramStart"/>
+      <w:r>
+        <w:t>note</w:t>
+      </w:r>
+      <w:proofErr w:type="gramEnd"/>
+      <w:r>
+        <w:t xml:space="preserve"> on the source: the 2.82 m entry is headed </w:t>
+      </w:r>
+      <w:proofErr w:type="spellStart"/>
+      <w:r>
+        <w:t>LCOG_Offset</w:t>
+      </w:r>
+      <w:proofErr w:type="spellEnd"/>
+      <w:r>
+        <w:t xml:space="preserve"> in [1] (LCOGO in [2]) and is the along-axis distance from the assembly's centre of gravity to the perpendicular through the dipper bail (point E, which lies above the handle axis); </w:t>
+      </w:r>
+      <w:proofErr w:type="spellStart"/>
+      <w:r>
+        <w:t>Rasuli's</w:t>
+      </w:r>
+      <w:proofErr w:type="spellEnd"/>
+      <w:r>
+        <w:t xml:space="preserve"> own construction </w:t>
+      </w:r>
+      <w:proofErr w:type="spellStart"/>
+      <w:r>
+        <w:t>r_cd</w:t>
+      </w:r>
+      <w:proofErr w:type="spellEnd"/>
+      <w:r>
+        <w:t xml:space="preserve"> = d₄ − </w:t>
+      </w:r>
+      <w:proofErr w:type="spellStart"/>
+      <w:r>
+        <w:t>LCOG_Offset</w:t>
+      </w:r>
+      <w:proofErr w:type="spellEnd"/>
+      <w:r>
+        <w:t xml:space="preserve"> (eq. 56 of [2]) uses it exactly as this model does. The hoist and crowd motor constants reported in the same table, K_H = 1940 N/A and K_C = 3950 N/A, are recorded for the field phase (Milestone M5).</w:t>
       </w:r>
     </w:p>
     <w:p>
@@ -4047,8 +4266,13 @@
         <w:pStyle w:val="Heading2"/>
       </w:pPr>
       <w:bookmarkStart w:id="9" w:name="_Toc235803513"/>
-      <w:r>
-        <w:t>3.1  An independent oracle</w:t>
+      <w:proofErr w:type="gramStart"/>
+      <w:r>
+        <w:t>3.1  An</w:t>
+      </w:r>
+      <w:proofErr w:type="gramEnd"/>
+      <w:r>
+        <w:t xml:space="preserve"> independent oracle</w:t>
       </w:r>
       <w:bookmarkEnd w:id="9"/>
     </w:p>
@@ -4058,7 +4282,31 @@
         <w:jc w:val="both"/>
       </w:pPr>
       <w:r>
-        <w:t>Verification requires a referee that cannot share the model's mistakes. The referee is a Simscape Multibody simulation of the same mechanism, constructed from part definitions — bodies, joints, transforms, gravity — from which the engine assembles constrained Newton–Euler equations numerically. It never sees the hand-derived algebra. One implementation convention is recorded for reproducibility: the rigid transform between the joints rotates the body frame 90° about +y, so the inertia about the spin axis — written Izz in Section 2 — occupies the first (local-x) slot of the Simscape body's moment-of-inertia vector. Agreement between the two is therefore evidence in the way two independent laboratories agreeing is evidence; had the analytical equations been coded as the simulation, agreement would only prove the same algebra was typed twice. The simulation prescribes smooth sinusoidal motion (q₃ = 45° ± 15°, d₄ = 8.75 ± 2 m, ω = π/10 rad/s) and senses the joint torque and force required — inverse dynamics, the same direction of inference the field problem poses, requiring no controller whose errors could contaminate the comparison.</w:t>
+        <w:t xml:space="preserve">Verification requires a referee that cannot share the model's mistakes. The referee is a </w:t>
+      </w:r>
+      <w:proofErr w:type="spellStart"/>
+      <w:r>
+        <w:t>Simscape</w:t>
+      </w:r>
+      <w:proofErr w:type="spellEnd"/>
+      <w:r>
+        <w:t xml:space="preserve"> Multibody simulation of the same mechanism, constructed from part definitions — bodies, joints, transforms, gravity — from which the engine assembles constrained Newton–Euler equations numerically. It never sees the hand-derived algebra. One implementation convention is recorded for reproducibility: the rigid transform between the joints rotates the body frame 90° about +y, so the inertia about the spin axis — written </w:t>
+      </w:r>
+      <w:proofErr w:type="spellStart"/>
+      <w:r>
+        <w:t>Izz</w:t>
+      </w:r>
+      <w:proofErr w:type="spellEnd"/>
+      <w:r>
+        <w:t xml:space="preserve"> in Section 2 — occupies the first (local-x) slot of the </w:t>
+      </w:r>
+      <w:proofErr w:type="spellStart"/>
+      <w:r>
+        <w:t>Simscape</w:t>
+      </w:r>
+      <w:proofErr w:type="spellEnd"/>
+      <w:r>
+        <w:t xml:space="preserve"> body's moment-of-inertia vector. Agreement between the two is therefore evidence in the way two independent laboratories agreeing is evidence; had the analytical equations been coded as the simulation, agreement would only prove the same algebra was typed twice. The simulation prescribes smooth sinusoidal motion (q₃ = 45° ± 15°, d₄ = 8.75 ± 2 m, ω = π/10 rad/s) and senses the joint torque and force required — inverse dynamics, the same direction of inference the field problem poses, requiring no controller whose errors could contaminate the comparison.</w:t>
       </w:r>
     </w:p>
     <w:p>
@@ -4066,8 +4314,13 @@
         <w:pStyle w:val="Heading2"/>
       </w:pPr>
       <w:bookmarkStart w:id="10" w:name="_Toc235803514"/>
-      <w:r>
-        <w:t>3.2  The isolation protocol</w:t>
+      <w:proofErr w:type="gramStart"/>
+      <w:r>
+        <w:t>3.2  The</w:t>
+      </w:r>
+      <w:proofErr w:type="gramEnd"/>
+      <w:r>
+        <w:t xml:space="preserve"> isolation protocol</w:t>
       </w:r>
       <w:bookmarkEnd w:id="10"/>
     </w:p>
@@ -4150,8 +4403,20 @@
                 <w:sz w:val="19"/>
                 <w:szCs w:val="19"/>
               </w:rPr>
-              <w:t>Isolation move</w:t>
-            </w:r>
+              <w:t xml:space="preserve">Isolation </w:t>
+            </w:r>
+            <w:proofErr w:type="gramStart"/>
+            <w:r>
+              <w:rPr>
+                <w:b/>
+                <w:bCs/>
+                <w:color w:val="FFFFFF"/>
+                <w:sz w:val="19"/>
+                <w:szCs w:val="19"/>
+              </w:rPr>
+              <w:t>move</w:t>
+            </w:r>
+            <w:proofErr w:type="gramEnd"/>
           </w:p>
         </w:tc>
         <w:tc>
@@ -4449,8 +4714,21 @@
         <w:pStyle w:val="Heading2"/>
       </w:pPr>
       <w:bookmarkStart w:id="11" w:name="_Toc235803515"/>
-      <w:r>
-        <w:t>3.3  Sensed accelerations, data conditioning, and the startup transient</w:t>
+      <w:proofErr w:type="gramStart"/>
+      <w:r>
+        <w:t>3.3  Sensed</w:t>
+      </w:r>
+      <w:proofErr w:type="gramEnd"/>
+      <w:r>
+        <w:t xml:space="preserve"> accelerations, data conditioning, and the </w:t>
+      </w:r>
+      <w:proofErr w:type="spellStart"/>
+      <w:r>
+        <w:t>startup</w:t>
+      </w:r>
+      <w:proofErr w:type="spellEnd"/>
+      <w:r>
+        <w:t xml:space="preserve"> transient</w:t>
       </w:r>
       <w:bookmarkEnd w:id="11"/>
     </w:p>
@@ -4460,7 +4738,15 @@
         <w:jc w:val="both"/>
       </w:pPr>
       <w:r>
-        <w:t>Two instruments are kept deliberately separate throughout: forward validation (parameters known — does the predicted torque match?) certifies the equations; offline identification (parameters withheld — can data recover them?) certifies the estimation machinery and, run against the oracle, X-rays the simulation's actual geometry. Conflating them hides errors; separated, each catches what the other misses.</w:t>
+        <w:t xml:space="preserve">Two instruments are kept deliberately separate throughout: forward validation (parameters known — does the predicted torque match?) certifies the equations; offline identification (parameters withheld — can data recover them?) certifies the estimation machinery and, run against the oracle, X-rays the simulation's actual geometry. Conflating them hides errors; separated, each </w:t>
+      </w:r>
+      <w:proofErr w:type="gramStart"/>
+      <w:r>
+        <w:t>catches</w:t>
+      </w:r>
+      <w:proofErr w:type="gramEnd"/>
+      <w:r>
+        <w:t xml:space="preserve"> what the other misses.</w:t>
       </w:r>
     </w:p>
     <w:p>
@@ -4487,8 +4773,13 @@
         <w:pStyle w:val="Heading2"/>
       </w:pPr>
       <w:bookmarkStart w:id="13" w:name="_Toc235803517"/>
-      <w:r>
-        <w:t>4.1  Linear-in-parameters formulation</w:t>
+      <w:proofErr w:type="gramStart"/>
+      <w:r>
+        <w:t>4.1  Linear</w:t>
+      </w:r>
+      <w:proofErr w:type="gramEnd"/>
+      <w:r>
+        <w:t>-in-parameters formulation</w:t>
       </w:r>
       <w:bookmarkEnd w:id="13"/>
     </w:p>
@@ -4498,7 +4789,15 @@
         <w:jc w:val="both"/>
       </w:pPr>
       <w:r>
-        <w:t>Following Tafazoli et al. [5], the model is regrouped so that the unknowns enter linearly:</w:t>
+        <w:t xml:space="preserve">Following </w:t>
+      </w:r>
+      <w:proofErr w:type="spellStart"/>
+      <w:r>
+        <w:t>Tafazoli</w:t>
+      </w:r>
+      <w:proofErr w:type="spellEnd"/>
+      <w:r>
+        <w:t xml:space="preserve"> et al. [5], the model is regrouped so that the unknowns enter linearly:</w:t>
       </w:r>
     </w:p>
     <w:p>
@@ -4594,6 +4893,7 @@
       <w:r>
         <w:t xml:space="preserve">, c, </w:t>
       </w:r>
+      <w:proofErr w:type="spellStart"/>
       <w:r>
         <w:rPr>
           <w:rFonts w:ascii="Cambria Math" w:eastAsia="Cambria Math" w:hAnsi="Cambria Math" w:cs="Cambria Math"/>
@@ -4611,6 +4911,7 @@
         </w:rPr>
         <w:t>zz</w:t>
       </w:r>
+      <w:proofErr w:type="spellEnd"/>
       <w:r>
         <w:t>) into one exactly linear in θ — convex, with a unique closed-form solution and no initial guess. Ordinary least squares with covariance-based uncertainty gives</w:t>
       </w:r>
@@ -4686,7 +4987,15 @@
         <w:jc w:val="both"/>
       </w:pPr>
       <w:r>
-        <w:t>Physical parameters are recovered by un-grouping (ĉ = θ̂₂/θ̂₁, Î_zz = θ̂₃ − θ̂₂²/θ̂₁), with uncertainty propagated by the delta method. Confidence intervals are read as first-class results: an interval spanning zero, or comparable to its own estimate, is the estimator's declaration that the experiment cannot identify that parameter — not a value to be reported without its width.</w:t>
+        <w:t xml:space="preserve">Physical parameters are recovered by un-grouping (ĉ = θ̂₂/θ̂₁, </w:t>
+      </w:r>
+      <w:proofErr w:type="spellStart"/>
+      <w:r>
+        <w:t>Î_zz</w:t>
+      </w:r>
+      <w:proofErr w:type="spellEnd"/>
+      <w:r>
+        <w:t xml:space="preserve"> = θ̂₃ − θ̂₂²/θ̂₁), with uncertainty propagated by the delta method. Confidence intervals are read as first-class results: an interval spanning zero, or comparable to its own estimate, is the estimator's declaration that the experiment cannot identify that parameter — not a value to be reported without its width.</w:t>
       </w:r>
     </w:p>
     <w:p>
@@ -4694,8 +5003,13 @@
         <w:pStyle w:val="Heading2"/>
       </w:pPr>
       <w:bookmarkStart w:id="14" w:name="_Toc235803518"/>
-      <w:r>
-        <w:t>4.2  Conditioning and excitation design</w:t>
+      <w:proofErr w:type="gramStart"/>
+      <w:r>
+        <w:t>4.2  Conditioning</w:t>
+      </w:r>
+      <w:proofErr w:type="gramEnd"/>
+      <w:r>
+        <w:t xml:space="preserve"> and excitation design</w:t>
       </w:r>
       <w:bookmarkEnd w:id="14"/>
     </w:p>
@@ -4705,7 +5019,15 @@
         <w:jc w:val="both"/>
       </w:pPr>
       <w:r>
-        <w:t xml:space="preserve">Estimates are only as good as the experiment that produced them, audited continuously through the condition number of Y and the per-parameter intervals, printed on every analysis run. Three design elements govern identifiability here. The saddle bias of 45° with ±15° amplitude keeps both cos q₃ and sin q₃ varying, so the gravity columns remain informative. The crowd amplitude was widened from an initial ±0.25 m to ±2 m after cond(Y) exceeded 10³ — the lever arm must visibly change for the estimator to separate </w:t>
+        <w:t xml:space="preserve">Estimates are only as good as the experiment that produced them, audited continuously through the condition number of Y and the per-parameter intervals, printed on every analysis run. Three design elements govern identifiability here. The saddle bias of 45° with ±15° amplitude keeps both cos q₃ and sin q₃ varying, so the gravity columns remain informative. The crowd amplitude was widened from an initial ±0.25 m to ±2 m after </w:t>
+      </w:r>
+      <w:proofErr w:type="spellStart"/>
+      <w:r>
+        <w:t>cond</w:t>
+      </w:r>
+      <w:proofErr w:type="spellEnd"/>
+      <w:r>
+        <w:t xml:space="preserve">(Y) exceeded 10³ — the lever arm must visibly change for the estimator to separate </w:t>
       </w:r>
       <w:r>
         <w:rPr>
@@ -4747,6 +5069,7 @@
       <w:r>
         <w:t xml:space="preserve"> c and </w:t>
       </w:r>
+      <w:proofErr w:type="spellStart"/>
       <w:r>
         <w:rPr>
           <w:rFonts w:ascii="Cambria Math" w:eastAsia="Cambria Math" w:hAnsi="Cambria Math" w:cs="Cambria Math"/>
@@ -4764,9 +5087,27 @@
         </w:rPr>
         <w:t>zz</w:t>
       </w:r>
-      <w:r>
-        <w:t xml:space="preserve">; after the change, the column-scaled condition number fell to ≈82–87. One residual weakness is stated: both joints share a single excitation frequency (π/10 rad/s), leaving partial column correlation; decorrelated frequencies and phases are scheduled before Milestone M2. A physical asymmetry is also acknowledged: gravity contributes ≈2.5 MN·m while inertial terms contribute ≈10 kN·m at shovel timescales, so mass and lever parameters are intrinsically well-excited and </w:t>
-      </w:r>
+      <w:proofErr w:type="spellEnd"/>
+      <w:r>
+        <w:t xml:space="preserve">; after the change, the column-scaled condition number fell to ≈82–87. One residual weakness is stated: both joints share a single excitation frequency (π/10 rad/s), leaving partial column correlation; decorrelated frequencies and phases are scheduled before Milestone M2. A physical asymmetry is also acknowledged: gravity contributes ≈2.5 </w:t>
+      </w:r>
+      <w:proofErr w:type="spellStart"/>
+      <w:r>
+        <w:t>MN·m</w:t>
+      </w:r>
+      <w:proofErr w:type="spellEnd"/>
+      <w:r>
+        <w:t xml:space="preserve"> while inertial terms contribute ≈10 </w:t>
+      </w:r>
+      <w:proofErr w:type="spellStart"/>
+      <w:r>
+        <w:t>kN·m</w:t>
+      </w:r>
+      <w:proofErr w:type="spellEnd"/>
+      <w:r>
+        <w:t xml:space="preserve"> at shovel timescales, so mass and lever parameters are intrinsically well-excited and </w:t>
+      </w:r>
+      <w:proofErr w:type="spellStart"/>
       <w:r>
         <w:rPr>
           <w:rFonts w:ascii="Cambria Math" w:eastAsia="Cambria Math" w:hAnsi="Cambria Math" w:cs="Cambria Math"/>
@@ -4784,6 +5125,7 @@
         </w:rPr>
         <w:t>zz</w:t>
       </w:r>
+      <w:proofErr w:type="spellEnd"/>
       <w:r>
         <w:t xml:space="preserve"> intrinsically fragile — the reason acceleration quality (Section 5.3) dominates inertia identifiability.</w:t>
       </w:r>
@@ -4793,8 +5135,13 @@
         <w:pStyle w:val="Heading2"/>
       </w:pPr>
       <w:bookmarkStart w:id="15" w:name="_Toc235803519"/>
-      <w:r>
-        <w:t>4.3  Metrics and provenance</w:t>
+      <w:proofErr w:type="gramStart"/>
+      <w:r>
+        <w:t>4.3  Metrics</w:t>
+      </w:r>
+      <w:proofErr w:type="gramEnd"/>
+      <w:r>
+        <w:t xml:space="preserve"> and provenance</w:t>
       </w:r>
       <w:bookmarkEnd w:id="15"/>
     </w:p>
@@ -4878,7 +5225,47 @@
         <w:jc w:val="both"/>
       </w:pPr>
       <w:r>
-        <w:t>Every numerical claim in this report is receipted in the project's claims register with source, page, and verification status. Two provenance incidents are disclosed deliberately. An early parameter file mis-read a column of Table II; re-derivation against the paper caught it, and the correction is on record under version control. Separately, a claimed benchmark (“Rasuli reports R² = 0.942”) circulating in early drafts could not be located in [1] — the paper reports payload means and standard deviations (e.g., 8,402 kg estimated vs 8,420 kg actual, σ = 104 kg, swing regime), not a validation R² — and the claim was struck. One units trap is recorded for reproducibility: the joint dialog accepts viscous damping in N·m/(deg/s), so 3,800 N·m·s/rad enters as 66.3225; the parameter file performs the conversion in exactly one place.</w:t>
+        <w:t>Every numerical claim in this report is receipted in the project's claims register with source, page, and verification status. Two provenance incidents are disclosed deliberately. An early parameter file mis-read a column of Table II; re-derivation against the paper caught it, and the correction is on record under version control. Separately, a claimed benchmark (“</w:t>
+      </w:r>
+      <w:proofErr w:type="spellStart"/>
+      <w:r>
+        <w:t>Rasuli</w:t>
+      </w:r>
+      <w:proofErr w:type="spellEnd"/>
+      <w:r>
+        <w:t xml:space="preserve"> reports R² = 0.942”) circulating in early drafts could not be located in [1] — the paper reports payload means and standard deviations (e.g., 8,402 kg estimated vs 8,420 kg actual, σ = 104 kg, swing regime), not a validation R² — and the claim was struck. One </w:t>
+      </w:r>
+      <w:proofErr w:type="gramStart"/>
+      <w:r>
+        <w:t>units</w:t>
+      </w:r>
+      <w:proofErr w:type="gramEnd"/>
+      <w:r>
+        <w:t xml:space="preserve"> trap is recorded for reproducibility: the joint dialog accepts viscous damping in </w:t>
+      </w:r>
+      <w:proofErr w:type="spellStart"/>
+      <w:r>
+        <w:t>N·m</w:t>
+      </w:r>
+      <w:proofErr w:type="spellEnd"/>
+      <w:r>
+        <w:t>/(</w:t>
+      </w:r>
+      <w:proofErr w:type="spellStart"/>
+      <w:r>
+        <w:t>deg</w:t>
+      </w:r>
+      <w:proofErr w:type="spellEnd"/>
+      <w:r>
+        <w:t xml:space="preserve">/s), so 3,800 </w:t>
+      </w:r>
+      <w:proofErr w:type="spellStart"/>
+      <w:r>
+        <w:t>N·m·s</w:t>
+      </w:r>
+      <w:proofErr w:type="spellEnd"/>
+      <w:r>
+        <w:t>/rad enters as 66.3225; the parameter file performs the conversion in exactly one place.</w:t>
       </w:r>
     </w:p>
     <w:p>
@@ -4896,8 +5283,13 @@
         <w:pStyle w:val="Heading2"/>
       </w:pPr>
       <w:bookmarkStart w:id="17" w:name="_Toc235803521"/>
-      <w:r>
-        <w:t>5.1  Excitation and forward validation</w:t>
+      <w:proofErr w:type="gramStart"/>
+      <w:r>
+        <w:t>5.1  Excitation</w:t>
+      </w:r>
+      <w:proofErr w:type="gramEnd"/>
+      <w:r>
+        <w:t xml:space="preserve"> and forward validation</w:t>
       </w:r>
       <w:bookmarkEnd w:id="17"/>
     </w:p>
@@ -4907,7 +5299,23 @@
         <w:jc w:val="both"/>
       </w:pPr>
       <w:r>
-        <w:t>Figure 2 shows the excitation trajectories. Under sensed accelerations, the saddle equation reproduces the oracle with R² = 1.000000 and RMSE = 0 N·m; residuals sit at the 10⁻¹³ level against a 2.4–2.9 MN·m signal — the floating-point floor (Figure 3). The crowd equation, validated for the first time in the programme, attains the same: R² = 1.000000, RMSE = 0 N (Figure 4). Agreement eleven orders of magnitude below signal scale between two independently constructed computations certifies the algebra, the geometry, and the parameter bookkeeping simultaneously. The residual panels of Figures 3–4 deserve a forward reading: that channel is the load channel of Equation 1 evaluated at zero load, and its machine-precision floor is the calibration certificate for the subtraction reference that Milestone M2 will populate with a real signal.</w:t>
+        <w:t xml:space="preserve">Figure 2 shows the excitation trajectories. Under sensed accelerations, the saddle equation reproduces the oracle with R² = 1.000000 and RMSE = 0 </w:t>
+      </w:r>
+      <w:proofErr w:type="spellStart"/>
+      <w:r>
+        <w:t>N·m</w:t>
+      </w:r>
+      <w:proofErr w:type="spellEnd"/>
+      <w:r>
+        <w:t xml:space="preserve">; residuals sit at the 10⁻¹³ level against a 2.4–2.9 </w:t>
+      </w:r>
+      <w:proofErr w:type="spellStart"/>
+      <w:r>
+        <w:t>MN·m</w:t>
+      </w:r>
+      <w:proofErr w:type="spellEnd"/>
+      <w:r>
+        <w:t xml:space="preserve"> signal — the floating-point floor (Figure 3). The crowd equation, validated for the first time in the programme, attains the same: R² = 1.000000, RMSE = 0 N (Figure 4). Agreement eleven orders of magnitude below signal scale between two independently constructed computations certifies the algebra, the geometry, and the parameter bookkeeping simultaneously. The residual panels of Figures 3–4 deserve a forward reading: that channel is the load channel of Equation 1 evaluated at zero load, and its machine-precision floor is the calibration certificate for the subtraction reference that Milestone M2 will populate with a real signal.</w:t>
       </w:r>
     </w:p>
     <w:p>
@@ -5110,8 +5518,13 @@
         <w:pStyle w:val="Heading2"/>
       </w:pPr>
       <w:bookmarkStart w:id="18" w:name="_Toc235803522"/>
-      <w:r>
-        <w:t>5.2  Blind parameter identification</w:t>
+      <w:proofErr w:type="gramStart"/>
+      <w:r>
+        <w:t>5.2  Blind</w:t>
+      </w:r>
+      <w:proofErr w:type="gramEnd"/>
+      <w:r>
+        <w:t xml:space="preserve"> parameter identification</w:t>
       </w:r>
       <w:bookmarkEnd w:id="18"/>
     </w:p>
@@ -5400,6 +5813,7 @@
             </w:tcMar>
           </w:tcPr>
           <w:p>
+            <w:proofErr w:type="spellStart"/>
             <w:r>
               <w:rPr>
                 <w:rFonts w:ascii="Cambria Math" w:eastAsia="Cambria Math" w:hAnsi="Cambria Math" w:cs="Cambria Math"/>
@@ -5421,6 +5835,7 @@
               </w:rPr>
               <w:t>zz</w:t>
             </w:r>
+            <w:proofErr w:type="spellEnd"/>
             <w:r>
               <w:rPr>
                 <w:sz w:val="19"/>
@@ -5509,7 +5924,23 @@
                 <w:sz w:val="19"/>
                 <w:szCs w:val="19"/>
               </w:rPr>
-              <w:t xml:space="preserve"> (N·m·s/rad)</w:t>
+              <w:t xml:space="preserve"> (</w:t>
+            </w:r>
+            <w:proofErr w:type="spellStart"/>
+            <w:r>
+              <w:rPr>
+                <w:sz w:val="19"/>
+                <w:szCs w:val="19"/>
+              </w:rPr>
+              <w:t>N·m·s</w:t>
+            </w:r>
+            <w:proofErr w:type="spellEnd"/>
+            <w:r>
+              <w:rPr>
+                <w:sz w:val="19"/>
+                <w:szCs w:val="19"/>
+              </w:rPr>
+              <w:t>/rad)</w:t>
             </w:r>
           </w:p>
         </w:tc>
@@ -5592,7 +6023,23 @@
                 <w:sz w:val="19"/>
                 <w:szCs w:val="19"/>
               </w:rPr>
-              <w:t xml:space="preserve"> (N·m)</w:t>
+              <w:t xml:space="preserve"> (</w:t>
+            </w:r>
+            <w:proofErr w:type="spellStart"/>
+            <w:r>
+              <w:rPr>
+                <w:sz w:val="19"/>
+                <w:szCs w:val="19"/>
+              </w:rPr>
+              <w:t>N·m</w:t>
+            </w:r>
+            <w:proofErr w:type="spellEnd"/>
+            <w:r>
+              <w:rPr>
+                <w:sz w:val="19"/>
+                <w:szCs w:val="19"/>
+              </w:rPr>
+              <w:t>)</w:t>
             </w:r>
           </w:p>
         </w:tc>
@@ -5724,8 +6171,13 @@
         <w:pStyle w:val="Heading2"/>
       </w:pPr>
       <w:bookmarkStart w:id="19" w:name="_Toc235803523"/>
-      <w:r>
-        <w:t>5.3  Differentiated vs sensed accelerations</w:t>
+      <w:proofErr w:type="gramStart"/>
+      <w:r>
+        <w:t>5.3  Differentiated</w:t>
+      </w:r>
+      <w:proofErr w:type="gramEnd"/>
+      <w:r>
+        <w:t xml:space="preserve"> vs sensed accelerations</w:t>
       </w:r>
       <w:bookmarkEnd w:id="19"/>
     </w:p>
@@ -5808,8 +6260,18 @@
         <w:pStyle w:val="Heading2"/>
       </w:pPr>
       <w:bookmarkStart w:id="20" w:name="_Toc235803524"/>
-      <w:r>
-        <w:t>5.4  Startup-transient ablation</w:t>
+      <w:proofErr w:type="gramStart"/>
+      <w:r>
+        <w:t xml:space="preserve">5.4  </w:t>
+      </w:r>
+      <w:proofErr w:type="spellStart"/>
+      <w:r>
+        <w:t>Startup</w:t>
+      </w:r>
+      <w:proofErr w:type="spellEnd"/>
+      <w:proofErr w:type="gramEnd"/>
+      <w:r>
+        <w:t>-transient ablation</w:t>
       </w:r>
       <w:bookmarkEnd w:id="20"/>
     </w:p>
@@ -5819,7 +6281,31 @@
         <w:jc w:val="both"/>
       </w:pPr>
       <w:r>
-        <w:t>A controlled ablation removed the 0.5 s trim of Section 3.3 while one equation ran on sensed accelerations and the other on the gradient fallback. The crowd equation, fed true accelerations, retained R² = 1.000000 through the startup spike — the transient is genuine rigid-body dynamics, exactly described by the model. The saddle equation on differentiated accelerations collapsed to R² = 0.933 (NRMSE 2.58%), and its identification became uninformative (Î_zz = 79,336 ± 143,359; f̂_v3 = −68,447 ± 242,596 — intervals larger than their estimates). The ablation separates the effects cleanly: the spike does not break the physics; it breaks numerical differentiation. The trim protects the analysis, not the model. A follow-up single-variable ablation (both equations on sensed accelerations, trim as the only change; archived under experiments/2026-07-15_trim_ablation/) sharpens the point: the untrimmed run recovers every parameter exactly and improves the scaled condition number from 82.2 to 13.4 — the large startup accelerations enrich the excitation. At this stage the trim is therefore conservative hygiene for later noisy or differentiated data, not a Stage-1 necessity.</w:t>
+        <w:t xml:space="preserve">A controlled ablation removed the 0.5 s trim of Section 3.3 while one equation ran on sensed accelerations and the other on the gradient fallback. The crowd equation, fed true accelerations, retained R² = 1.000000 through the </w:t>
+      </w:r>
+      <w:proofErr w:type="spellStart"/>
+      <w:r>
+        <w:t>startup</w:t>
+      </w:r>
+      <w:proofErr w:type="spellEnd"/>
+      <w:r>
+        <w:t xml:space="preserve"> spike — the transient is genuine rigid-body dynamics, exactly described by the model. The saddle equation on differentiated accelerations collapsed to R² = 0.933 (NRMSE 2.58%), and its identification became uninformative (</w:t>
+      </w:r>
+      <w:proofErr w:type="spellStart"/>
+      <w:r>
+        <w:t>Î_zz</w:t>
+      </w:r>
+      <w:proofErr w:type="spellEnd"/>
+      <w:r>
+        <w:t xml:space="preserve"> = 79,336 ± 143,359; f̂_v3 = −68,447 ± 242,596 — intervals larger than their estimates). The ablation separates the effects cleanly: the spike does not break the physics; it breaks numerical differentiation. The trim protects the analysis, not the model. A follow-up single-variable ablation (both equations on sensed accelerations, trim as the only change; archived under experiments/2026-07-15_trim_ablation/) sharpens the point: the untrimmed run recovers every parameter exactly and improves the scaled condition number from 82.2 to 13.4 — the large </w:t>
+      </w:r>
+      <w:proofErr w:type="spellStart"/>
+      <w:r>
+        <w:t>startup</w:t>
+      </w:r>
+      <w:proofErr w:type="spellEnd"/>
+      <w:r>
+        <w:t xml:space="preserve"> accelerations enrich the excitation. At this stage the trim is therefore conservative hygiene for later noisy or differentiated data, not a Stage-1 necessity.</w:t>
       </w:r>
     </w:p>
     <w:p>
@@ -5837,8 +6323,13 @@
         <w:pStyle w:val="Heading2"/>
       </w:pPr>
       <w:bookmarkStart w:id="22" w:name="_Toc235803526"/>
-      <w:r>
-        <w:t>6.1  What has and has not been proven</w:t>
+      <w:proofErr w:type="gramStart"/>
+      <w:r>
+        <w:t>6.1  What</w:t>
+      </w:r>
+      <w:proofErr w:type="gramEnd"/>
+      <w:r>
+        <w:t xml:space="preserve"> has and has not been proven</w:t>
       </w:r>
       <w:bookmarkEnd w:id="22"/>
     </w:p>
@@ -6278,7 +6769,23 @@
                 <w:sz w:val="19"/>
                 <w:szCs w:val="19"/>
               </w:rPr>
-              <w:t>Coulomb + Stribeck, temperature-dependent</w:t>
+              <w:t xml:space="preserve">Coulomb + </w:t>
+            </w:r>
+            <w:proofErr w:type="spellStart"/>
+            <w:r>
+              <w:rPr>
+                <w:sz w:val="19"/>
+                <w:szCs w:val="19"/>
+              </w:rPr>
+              <w:t>Stribeck</w:t>
+            </w:r>
+            <w:proofErr w:type="spellEnd"/>
+            <w:r>
+              <w:rPr>
+                <w:sz w:val="19"/>
+                <w:szCs w:val="19"/>
+              </w:rPr>
+              <w:t>, temperature-dependent</w:t>
             </w:r>
           </w:p>
         </w:tc>
@@ -6837,7 +7344,29 @@
           <w:sz w:val="18"/>
           <w:szCs w:val="18"/>
         </w:rPr>
-        <w:t>Table 2 — Assumptions ledger: each simplification and the milestone that removes it.</w:t>
+        <w:t xml:space="preserve">Table 2 — </w:t>
+      </w:r>
+      <w:proofErr w:type="gramStart"/>
+      <w:r>
+        <w:rPr>
+          <w:i/>
+          <w:iCs/>
+          <w:color w:val="595959"/>
+          <w:sz w:val="18"/>
+          <w:szCs w:val="18"/>
+        </w:rPr>
+        <w:t>Assumptions</w:t>
+      </w:r>
+      <w:proofErr w:type="gramEnd"/>
+      <w:r>
+        <w:rPr>
+          <w:i/>
+          <w:iCs/>
+          <w:color w:val="595959"/>
+          <w:sz w:val="18"/>
+          <w:szCs w:val="18"/>
+        </w:rPr>
+        <w:t xml:space="preserve"> ledger: each simplification and the milestone that removes it.</w:t>
       </w:r>
     </w:p>
     <w:p>
@@ -6845,8 +7374,13 @@
         <w:pStyle w:val="Heading2"/>
       </w:pPr>
       <w:bookmarkStart w:id="23" w:name="_Toc235803527"/>
-      <w:r>
-        <w:t>6.2  Outlook: from validated model to health monitor</w:t>
+      <w:proofErr w:type="gramStart"/>
+      <w:r>
+        <w:t>6.2  Outlook</w:t>
+      </w:r>
+      <w:proofErr w:type="gramEnd"/>
+      <w:r>
+        <w:t>: from validated model to health monitor</w:t>
       </w:r>
       <w:bookmarkEnd w:id="23"/>
     </w:p>
@@ -6948,42 +7482,9 @@
           <w:sz w:val="20"/>
           <w:szCs w:val="20"/>
         </w:rPr>
-        <w:t xml:space="preserve">[1]  </w:t>
-      </w:r>
-      <w:r>
-        <w:rPr>
-          <w:sz w:val="20"/>
-          <w:szCs w:val="20"/>
-        </w:rPr>
-        <w:t>A. Rasuli, S. Tafazoli and W. G. Dunford, “Dynamic modeling, parameter identification, and payload estimation of mining cable shovels,” IEEE Transactions on Industry Applications, vol. 50, no. 3, pp. 2127–2135, 2014.</w:t>
-      </w:r>
-    </w:p>
-    <w:p>
-      <w:r>
-        <w:rPr>
-          <w:b/>
-        </w:rPr>
-        <w:t xml:space="preserve">[2] </w:t>
-      </w:r>
-      <w:r>
-        <w:t>A. R. Rasuli, “Dynamic modeling, parameter identification, payload estimation, and non-contact arm geometry sensing of the mining cable shovel,” Ph.D. thesis, University of British Columbia, Vancouver, 2012. Open access: UBC cIRcle, item 1.0073407.</w:t>
-      </w:r>
-    </w:p>
-    <w:p>
-      <w:r>
-        <w:rPr>
-          <w:b/>
-        </w:rPr>
-        <w:t xml:space="preserve">[3] </w:t>
-      </w:r>
-      <w:r>
-        <w:t>M. W. Spong, S. Hutchinson, and M. Vidyasagar, Robot Modeling and Control. Hoboken, NJ: Wiley, 2006 (rigid-body kinetic-energy decomposition).</w:t>
-      </w:r>
-    </w:p>
-    <w:p>
-      <w:pPr>
-        <w:spacing w:after="110" w:line="276" w:lineRule="auto"/>
-      </w:pPr>
+        <w:t>[1</w:t>
+      </w:r>
+      <w:proofErr w:type="gramStart"/>
       <w:r>
         <w:rPr>
           <w:b/>
@@ -6991,14 +7492,132 @@
           <w:sz w:val="20"/>
           <w:szCs w:val="20"/>
         </w:rPr>
-        <w:t xml:space="preserve">[2]  </w:t>
+        <w:t xml:space="preserve">]  </w:t>
       </w:r>
       <w:r>
         <w:rPr>
           <w:sz w:val="20"/>
           <w:szCs w:val="20"/>
         </w:rPr>
-        <w:t>S. Frimpong and Y. Hu, “Cable shovel digging dynamics and simulation in oil sands excavation,” 2008.</w:t>
+        <w:t>A.</w:t>
+      </w:r>
+      <w:proofErr w:type="gramEnd"/>
+      <w:r>
+        <w:rPr>
+          <w:sz w:val="20"/>
+          <w:szCs w:val="20"/>
+        </w:rPr>
+        <w:t xml:space="preserve"> </w:t>
+      </w:r>
+      <w:proofErr w:type="spellStart"/>
+      <w:r>
+        <w:rPr>
+          <w:sz w:val="20"/>
+          <w:szCs w:val="20"/>
+        </w:rPr>
+        <w:t>Rasuli</w:t>
+      </w:r>
+      <w:proofErr w:type="spellEnd"/>
+      <w:r>
+        <w:rPr>
+          <w:sz w:val="20"/>
+          <w:szCs w:val="20"/>
+        </w:rPr>
+        <w:t xml:space="preserve">, S. </w:t>
+      </w:r>
+      <w:proofErr w:type="spellStart"/>
+      <w:r>
+        <w:rPr>
+          <w:sz w:val="20"/>
+          <w:szCs w:val="20"/>
+        </w:rPr>
+        <w:t>Tafazoli</w:t>
+      </w:r>
+      <w:proofErr w:type="spellEnd"/>
+      <w:r>
+        <w:rPr>
+          <w:sz w:val="20"/>
+          <w:szCs w:val="20"/>
+        </w:rPr>
+        <w:t xml:space="preserve"> and W. G. Dunford, “Dynamic </w:t>
+      </w:r>
+      <w:proofErr w:type="spellStart"/>
+      <w:r>
+        <w:rPr>
+          <w:sz w:val="20"/>
+          <w:szCs w:val="20"/>
+        </w:rPr>
+        <w:t>modeling</w:t>
+      </w:r>
+      <w:proofErr w:type="spellEnd"/>
+      <w:r>
+        <w:rPr>
+          <w:sz w:val="20"/>
+          <w:szCs w:val="20"/>
+        </w:rPr>
+        <w:t>, parameter identification, and payload estimation of mining cable shovels,” IEEE Transactions on Industry Applications, vol. 50, no. 3, pp. 2127–2135, 2014.</w:t>
+      </w:r>
+    </w:p>
+    <w:p>
+      <w:r>
+        <w:rPr>
+          <w:b/>
+        </w:rPr>
+        <w:t xml:space="preserve">[2] </w:t>
+      </w:r>
+      <w:r>
+        <w:t xml:space="preserve">A. R. </w:t>
+      </w:r>
+      <w:proofErr w:type="spellStart"/>
+      <w:r>
+        <w:t>Rasuli</w:t>
+      </w:r>
+      <w:proofErr w:type="spellEnd"/>
+      <w:r>
+        <w:t xml:space="preserve">, “Dynamic </w:t>
+      </w:r>
+      <w:proofErr w:type="spellStart"/>
+      <w:r>
+        <w:t>modeling</w:t>
+      </w:r>
+      <w:proofErr w:type="spellEnd"/>
+      <w:r>
+        <w:t xml:space="preserve">, parameter identification, payload estimation, and non-contact arm geometry sensing of the mining cable shovel,” Ph.D. thesis, University of British Columbia, Vancouver, 2012. Open access: UBC </w:t>
+      </w:r>
+      <w:proofErr w:type="spellStart"/>
+      <w:r>
+        <w:t>cIRcle</w:t>
+      </w:r>
+      <w:proofErr w:type="spellEnd"/>
+      <w:r>
+        <w:t>, item 1.0073407.</w:t>
+      </w:r>
+    </w:p>
+    <w:p>
+      <w:r>
+        <w:rPr>
+          <w:b/>
+        </w:rPr>
+        <w:t xml:space="preserve">[3] </w:t>
+      </w:r>
+      <w:r>
+        <w:t xml:space="preserve">M. W. </w:t>
+      </w:r>
+      <w:proofErr w:type="spellStart"/>
+      <w:r>
+        <w:t>Spong</w:t>
+      </w:r>
+      <w:proofErr w:type="spellEnd"/>
+      <w:r>
+        <w:t xml:space="preserve">, S. Hutchinson, and M. Vidyasagar, Robot </w:t>
+      </w:r>
+      <w:proofErr w:type="spellStart"/>
+      <w:r>
+        <w:t>Modeling</w:t>
+      </w:r>
+      <w:proofErr w:type="spellEnd"/>
+      <w:r>
+        <w:t xml:space="preserve"> and Control. Hoboken, NJ: Wiley, 2006 (rigid-body kinetic-energy decomposition).</w:t>
       </w:r>
     </w:p>
     <w:p>
@@ -7012,20 +7631,9 @@
           <w:sz w:val="20"/>
           <w:szCs w:val="20"/>
         </w:rPr>
-        <w:t xml:space="preserve">[3]  </w:t>
-      </w:r>
-      <w:r>
-        <w:rPr>
-          <w:sz w:val="20"/>
-          <w:szCs w:val="20"/>
-        </w:rPr>
-        <w:t>S. Frimpong, Y. Hu and K. Awuah-Offei, “Mechanics of cable shovel-formation interactions in surface mining excavations,” Journal of Terramechanics, vol. 42, 2005.</w:t>
-      </w:r>
-    </w:p>
-    <w:p>
-      <w:pPr>
-        <w:spacing w:after="110" w:line="276" w:lineRule="auto"/>
-      </w:pPr>
+        <w:t>[2</w:t>
+      </w:r>
+      <w:proofErr w:type="gramStart"/>
       <w:r>
         <w:rPr>
           <w:b/>
@@ -7033,14 +7641,22 @@
           <w:sz w:val="20"/>
           <w:szCs w:val="20"/>
         </w:rPr>
-        <w:t xml:space="preserve">[4]  </w:t>
+        <w:t xml:space="preserve">]  </w:t>
       </w:r>
       <w:r>
         <w:rPr>
           <w:sz w:val="20"/>
           <w:szCs w:val="20"/>
         </w:rPr>
-        <w:t>T. Fu et al., “Dig-load prediction of electric cable shovel based on hybrid physics-informed neural network,” Chinese Journal of Mechanical Engineering, vol. 35, 2022.</w:t>
+        <w:t>S.</w:t>
+      </w:r>
+      <w:proofErr w:type="gramEnd"/>
+      <w:r>
+        <w:rPr>
+          <w:sz w:val="20"/>
+          <w:szCs w:val="20"/>
+        </w:rPr>
+        <w:t xml:space="preserve"> Frimpong and Y. Hu, “Cable shovel digging dynamics and simulation in oil sands excavation,” 2008.</w:t>
       </w:r>
     </w:p>
     <w:p>
@@ -7054,14 +7670,174 @@
           <w:sz w:val="20"/>
           <w:szCs w:val="20"/>
         </w:rPr>
-        <w:t xml:space="preserve">[5]  </w:t>
-      </w:r>
-      <w:r>
-        <w:rPr>
+        <w:t>[3</w:t>
+      </w:r>
+      <w:proofErr w:type="gramStart"/>
+      <w:r>
+        <w:rPr>
+          <w:b/>
+          <w:bCs/>
           <w:sz w:val="20"/>
           <w:szCs w:val="20"/>
         </w:rPr>
-        <w:t>S. Tafazoli, P. D. Lawrence and S. E. Salcudean, “Identification of inertial and friction parameters for excavator arms,” IEEE Transactions on Robotics and Automation, vol. 15, no. 5, 1999.</w:t>
+        <w:t xml:space="preserve">]  </w:t>
+      </w:r>
+      <w:r>
+        <w:rPr>
+          <w:sz w:val="20"/>
+          <w:szCs w:val="20"/>
+        </w:rPr>
+        <w:t>S.</w:t>
+      </w:r>
+      <w:proofErr w:type="gramEnd"/>
+      <w:r>
+        <w:rPr>
+          <w:sz w:val="20"/>
+          <w:szCs w:val="20"/>
+        </w:rPr>
+        <w:t xml:space="preserve"> Frimpong, Y. Hu and K. Awuah-</w:t>
+      </w:r>
+      <w:proofErr w:type="spellStart"/>
+      <w:r>
+        <w:rPr>
+          <w:sz w:val="20"/>
+          <w:szCs w:val="20"/>
+        </w:rPr>
+        <w:t>Offei</w:t>
+      </w:r>
+      <w:proofErr w:type="spellEnd"/>
+      <w:r>
+        <w:rPr>
+          <w:sz w:val="20"/>
+          <w:szCs w:val="20"/>
+        </w:rPr>
+        <w:t xml:space="preserve">, “Mechanics of cable shovel-formation interactions in surface mining excavations,” Journal of </w:t>
+      </w:r>
+      <w:proofErr w:type="spellStart"/>
+      <w:r>
+        <w:rPr>
+          <w:sz w:val="20"/>
+          <w:szCs w:val="20"/>
+        </w:rPr>
+        <w:t>Terramechanics</w:t>
+      </w:r>
+      <w:proofErr w:type="spellEnd"/>
+      <w:r>
+        <w:rPr>
+          <w:sz w:val="20"/>
+          <w:szCs w:val="20"/>
+        </w:rPr>
+        <w:t>, vol. 42, 2005.</w:t>
+      </w:r>
+    </w:p>
+    <w:p>
+      <w:pPr>
+        <w:spacing w:after="110" w:line="276" w:lineRule="auto"/>
+      </w:pPr>
+      <w:r>
+        <w:rPr>
+          <w:b/>
+          <w:bCs/>
+          <w:sz w:val="20"/>
+          <w:szCs w:val="20"/>
+        </w:rPr>
+        <w:t>[4</w:t>
+      </w:r>
+      <w:proofErr w:type="gramStart"/>
+      <w:r>
+        <w:rPr>
+          <w:b/>
+          <w:bCs/>
+          <w:sz w:val="20"/>
+          <w:szCs w:val="20"/>
+        </w:rPr>
+        <w:t xml:space="preserve">]  </w:t>
+      </w:r>
+      <w:r>
+        <w:rPr>
+          <w:sz w:val="20"/>
+          <w:szCs w:val="20"/>
+        </w:rPr>
+        <w:t>T.</w:t>
+      </w:r>
+      <w:proofErr w:type="gramEnd"/>
+      <w:r>
+        <w:rPr>
+          <w:sz w:val="20"/>
+          <w:szCs w:val="20"/>
+        </w:rPr>
+        <w:t xml:space="preserve"> Fu et al., “Dig-load prediction of electric cable shovel based on hybrid physics-informed neural network,” Chinese Journal of Mechanical Engineering, vol. 35, 2022.</w:t>
+      </w:r>
+    </w:p>
+    <w:p>
+      <w:pPr>
+        <w:spacing w:after="110" w:line="276" w:lineRule="auto"/>
+      </w:pPr>
+      <w:r>
+        <w:rPr>
+          <w:b/>
+          <w:bCs/>
+          <w:sz w:val="20"/>
+          <w:szCs w:val="20"/>
+        </w:rPr>
+        <w:t>[5</w:t>
+      </w:r>
+      <w:proofErr w:type="gramStart"/>
+      <w:r>
+        <w:rPr>
+          <w:b/>
+          <w:bCs/>
+          <w:sz w:val="20"/>
+          <w:szCs w:val="20"/>
+        </w:rPr>
+        <w:t xml:space="preserve">]  </w:t>
+      </w:r>
+      <w:r>
+        <w:rPr>
+          <w:sz w:val="20"/>
+          <w:szCs w:val="20"/>
+        </w:rPr>
+        <w:t>S.</w:t>
+      </w:r>
+      <w:proofErr w:type="gramEnd"/>
+      <w:r>
+        <w:rPr>
+          <w:sz w:val="20"/>
+          <w:szCs w:val="20"/>
+        </w:rPr>
+        <w:t xml:space="preserve"> </w:t>
+      </w:r>
+      <w:proofErr w:type="spellStart"/>
+      <w:r>
+        <w:rPr>
+          <w:sz w:val="20"/>
+          <w:szCs w:val="20"/>
+        </w:rPr>
+        <w:t>Tafazoli</w:t>
+      </w:r>
+      <w:proofErr w:type="spellEnd"/>
+      <w:r>
+        <w:rPr>
+          <w:sz w:val="20"/>
+          <w:szCs w:val="20"/>
+        </w:rPr>
+        <w:t xml:space="preserve">, P. D. Lawrence and S. E. </w:t>
+      </w:r>
+      <w:proofErr w:type="spellStart"/>
+      <w:r>
+        <w:rPr>
+          <w:sz w:val="20"/>
+          <w:szCs w:val="20"/>
+        </w:rPr>
+        <w:t>Salcudean</w:t>
+      </w:r>
+      <w:proofErr w:type="spellEnd"/>
+      <w:r>
+        <w:rPr>
+          <w:sz w:val="20"/>
+          <w:szCs w:val="20"/>
+        </w:rPr>
+        <w:t>, “Identification of inertial and friction parameters for excavator arms,” IEEE Transactions on Robotics and Automation, vol. 15, no. 5, 1999.</w:t>
       </w:r>
     </w:p>
     <w:p>
@@ -7107,6 +7883,7 @@
       <w:r>
         <w:t xml:space="preserve">, moment of inertia </w:t>
       </w:r>
+      <w:proofErr w:type="spellStart"/>
       <w:r>
         <w:rPr>
           <w:rFonts w:ascii="Cambria Math" w:eastAsia="Cambria Math" w:hAnsi="Cambria Math" w:cs="Cambria Math"/>
@@ -7124,6 +7901,7 @@
         </w:rPr>
         <w:t>zz</w:t>
       </w:r>
+      <w:proofErr w:type="spellEnd"/>
       <w:r>
         <w:t xml:space="preserve"> about the spin-parallel axis through its COG) rotates about the saddle pivot by q₃ while translating along the handle by d₄. The COG lies on the slide axis at lever arm r = d₄ + c (c = −1.32 m). In the plane of motion, with gravity in-plane:</w:t>
       </w:r>
@@ -7243,6 +8021,7 @@
       <w:r>
         <w:t xml:space="preserve">Step 2 — kinetic energy. By König's theorem [3], translation of the COG plus rotation about it (the q̇₃² term with </w:t>
       </w:r>
+      <w:proofErr w:type="spellStart"/>
       <w:r>
         <w:rPr>
           <w:rFonts w:ascii="Cambria Math" w:eastAsia="Cambria Math" w:hAnsi="Cambria Math" w:cs="Cambria Math"/>
@@ -7260,6 +8039,7 @@
         </w:rPr>
         <w:t>zz</w:t>
       </w:r>
+      <w:proofErr w:type="spellEnd"/>
       <w:r>
         <w:t xml:space="preserve"> is the origin, together with the </w:t>
       </w:r>
@@ -7339,7 +8119,15 @@
         <w:jc w:val="both"/>
       </w:pPr>
       <w:r>
-        <w:t>Step 3 — potential energy and the Lagrangian. The COG height above the pivot is r sin q₃:</w:t>
+        <w:t xml:space="preserve">Step 3 — potential energy and the </w:t>
+      </w:r>
+      <w:proofErr w:type="spellStart"/>
+      <w:r>
+        <w:t>Lagrangian</w:t>
+      </w:r>
+      <w:proofErr w:type="spellEnd"/>
+      <w:r>
+        <w:t>. The COG height above the pivot is r sin q₃:</w:t>
       </w:r>
     </w:p>
     <w:p>
@@ -7513,7 +8301,15 @@
         <w:jc w:val="both"/>
       </w:pPr>
       <w:r>
-        <w:t>Step 6 — assemble Equation 2 for q₃ and append the dissipative (viscous) generalized force, which the conservative Lagrangian cannot produce (formally, a Rayleigh dissipation term):</w:t>
+        <w:t xml:space="preserve">Step 6 — assemble Equation 2 for q₃ and append the dissipative (viscous) generalized force, which the conservative </w:t>
+      </w:r>
+      <w:proofErr w:type="spellStart"/>
+      <w:r>
+        <w:t>Lagrangian</w:t>
+      </w:r>
+      <w:proofErr w:type="spellEnd"/>
+      <w:r>
+        <w:t xml:space="preserve"> cannot produce (formally, a Rayleigh dissipation term):</w:t>
       </w:r>
     </w:p>
     <w:p>
@@ -7768,8 +8564,13 @@
         <w:pStyle w:val="Heading2"/>
       </w:pPr>
       <w:bookmarkStart w:id="27" w:name="_Toc235803531"/>
-      <w:r>
-        <w:t>B.1  Design-decision ledger</w:t>
+      <w:proofErr w:type="gramStart"/>
+      <w:r>
+        <w:t>B.1  Design</w:t>
+      </w:r>
+      <w:proofErr w:type="gramEnd"/>
+      <w:r>
+        <w:t>-decision ledger</w:t>
       </w:r>
       <w:bookmarkEnd w:id="27"/>
     </w:p>
@@ -7955,12 +8756,21 @@
             </w:tcMar>
           </w:tcPr>
           <w:p>
-            <w:r>
-              <w:rPr>
-                <w:sz w:val="19"/>
-                <w:szCs w:val="19"/>
-              </w:rPr>
-              <w:t>Simscape referee</w:t>
+            <w:proofErr w:type="spellStart"/>
+            <w:r>
+              <w:rPr>
+                <w:sz w:val="19"/>
+                <w:szCs w:val="19"/>
+              </w:rPr>
+              <w:t>Simscape</w:t>
+            </w:r>
+            <w:proofErr w:type="spellEnd"/>
+            <w:r>
+              <w:rPr>
+                <w:sz w:val="19"/>
+                <w:szCs w:val="19"/>
+              </w:rPr>
+              <w:t xml:space="preserve"> referee</w:t>
             </w:r>
           </w:p>
         </w:tc>
@@ -8243,12 +9053,21 @@
             </w:tcMar>
           </w:tcPr>
           <w:p>
-            <w:r>
-              <w:rPr>
-                <w:sz w:val="19"/>
-                <w:szCs w:val="19"/>
-              </w:rPr>
-              <w:t>sgn(q̇) discontinuity vs variable-step solver; null return is a negative control</w:t>
+            <w:proofErr w:type="spellStart"/>
+            <w:r>
+              <w:rPr>
+                <w:sz w:val="19"/>
+                <w:szCs w:val="19"/>
+              </w:rPr>
+              <w:t>sgn</w:t>
+            </w:r>
+            <w:proofErr w:type="spellEnd"/>
+            <w:r>
+              <w:rPr>
+                <w:sz w:val="19"/>
+                <w:szCs w:val="19"/>
+              </w:rPr>
+              <w:t>(q̇) discontinuity vs variable-step solver; null return is a negative control</w:t>
             </w:r>
           </w:p>
         </w:tc>
@@ -8310,7 +9129,23 @@
                 <w:sz w:val="19"/>
                 <w:szCs w:val="19"/>
               </w:rPr>
-              <w:t>Incident: linspace misalignment corrupted every derivative</w:t>
+              <w:t xml:space="preserve">Incident: </w:t>
+            </w:r>
+            <w:proofErr w:type="spellStart"/>
+            <w:r>
+              <w:rPr>
+                <w:sz w:val="19"/>
+                <w:szCs w:val="19"/>
+              </w:rPr>
+              <w:t>linspace</w:t>
+            </w:r>
+            <w:proofErr w:type="spellEnd"/>
+            <w:r>
+              <w:rPr>
+                <w:sz w:val="19"/>
+                <w:szCs w:val="19"/>
+              </w:rPr>
+              <w:t xml:space="preserve"> misalignment corrupted every derivative</w:t>
             </w:r>
           </w:p>
         </w:tc>
@@ -8374,6 +9209,7 @@
               </w:rPr>
               <w:t xml:space="preserve">56% </w:t>
             </w:r>
+            <w:proofErr w:type="spellStart"/>
             <w:r>
               <w:rPr>
                 <w:rFonts w:ascii="Cambria Math" w:eastAsia="Cambria Math" w:hAnsi="Cambria Math" w:cs="Cambria Math"/>
@@ -8395,12 +9231,29 @@
               </w:rPr>
               <w:t>zz</w:t>
             </w:r>
-            <w:r>
-              <w:rPr>
-                <w:sz w:val="19"/>
-                <w:szCs w:val="19"/>
-              </w:rPr>
-              <w:t xml:space="preserve"> bias vs exact recovery (Section 5.3); also a field finding</w:t>
+            <w:proofErr w:type="spellEnd"/>
+            <w:r>
+              <w:rPr>
+                <w:sz w:val="19"/>
+                <w:szCs w:val="19"/>
+              </w:rPr>
+              <w:t xml:space="preserve"> bias vs exact recovery (Section 5.3); </w:t>
+            </w:r>
+            <w:proofErr w:type="gramStart"/>
+            <w:r>
+              <w:rPr>
+                <w:sz w:val="19"/>
+                <w:szCs w:val="19"/>
+              </w:rPr>
+              <w:t>also</w:t>
+            </w:r>
+            <w:proofErr w:type="gramEnd"/>
+            <w:r>
+              <w:rPr>
+                <w:sz w:val="19"/>
+                <w:szCs w:val="19"/>
+              </w:rPr>
+              <w:t xml:space="preserve"> a field finding</w:t>
             </w:r>
           </w:p>
         </w:tc>
@@ -8442,8 +9295,17 @@
                 <w:sz w:val="19"/>
                 <w:szCs w:val="19"/>
               </w:rPr>
-              <w:t>Chirp / multisine</w:t>
-            </w:r>
+              <w:t xml:space="preserve">Chirp / </w:t>
+            </w:r>
+            <w:proofErr w:type="spellStart"/>
+            <w:r>
+              <w:rPr>
+                <w:sz w:val="19"/>
+                <w:szCs w:val="19"/>
+              </w:rPr>
+              <w:t>multisine</w:t>
+            </w:r>
+            <w:proofErr w:type="spellEnd"/>
           </w:p>
         </w:tc>
         <w:tc>
@@ -8462,7 +9324,23 @@
                 <w:sz w:val="19"/>
                 <w:szCs w:val="19"/>
               </w:rPr>
-              <w:t>Analytic debuggability (frequency-doubling diagnostic); multisine is the field upgrade</w:t>
+              <w:t xml:space="preserve">Analytic debuggability (frequency-doubling diagnostic); </w:t>
+            </w:r>
+            <w:proofErr w:type="spellStart"/>
+            <w:r>
+              <w:rPr>
+                <w:sz w:val="19"/>
+                <w:szCs w:val="19"/>
+              </w:rPr>
+              <w:t>multisine</w:t>
+            </w:r>
+            <w:proofErr w:type="spellEnd"/>
+            <w:r>
+              <w:rPr>
+                <w:sz w:val="19"/>
+                <w:szCs w:val="19"/>
+              </w:rPr>
+              <w:t xml:space="preserve"> is the field upgrade</w:t>
             </w:r>
           </w:p>
         </w:tc>
@@ -8519,12 +9397,21 @@
             </w:tcMar>
           </w:tcPr>
           <w:p>
-            <w:r>
-              <w:rPr>
-                <w:sz w:val="19"/>
-                <w:szCs w:val="19"/>
-              </w:rPr>
-              <w:t>Startup transient is an initial-condition artifact (Section 3.3, Section 5.4)</w:t>
+            <w:proofErr w:type="spellStart"/>
+            <w:r>
+              <w:rPr>
+                <w:sz w:val="19"/>
+                <w:szCs w:val="19"/>
+              </w:rPr>
+              <w:t>Startup</w:t>
+            </w:r>
+            <w:proofErr w:type="spellEnd"/>
+            <w:r>
+              <w:rPr>
+                <w:sz w:val="19"/>
+                <w:szCs w:val="19"/>
+              </w:rPr>
+              <w:t xml:space="preserve"> transient is an initial-condition artifact (Section 3.3, Section 5.4)</w:t>
             </w:r>
           </w:p>
         </w:tc>
@@ -8566,7 +9453,39 @@
                 <w:sz w:val="19"/>
                 <w:szCs w:val="19"/>
               </w:rPr>
-              <w:t>Explicit-e model (gravity M_d g(r cos q₃ − e sin q₃); extra regressor column)</w:t>
+              <w:t xml:space="preserve">Explicit-e model (gravity </w:t>
+            </w:r>
+            <w:proofErr w:type="spellStart"/>
+            <w:r>
+              <w:rPr>
+                <w:sz w:val="19"/>
+                <w:szCs w:val="19"/>
+              </w:rPr>
+              <w:t>M_d</w:t>
+            </w:r>
+            <w:proofErr w:type="spellEnd"/>
+            <w:r>
+              <w:rPr>
+                <w:sz w:val="19"/>
+                <w:szCs w:val="19"/>
+              </w:rPr>
+              <w:t xml:space="preserve"> </w:t>
+            </w:r>
+            <w:proofErr w:type="gramStart"/>
+            <w:r>
+              <w:rPr>
+                <w:sz w:val="19"/>
+                <w:szCs w:val="19"/>
+              </w:rPr>
+              <w:t>g(</w:t>
+            </w:r>
+            <w:proofErr w:type="gramEnd"/>
+            <w:r>
+              <w:rPr>
+                <w:sz w:val="19"/>
+                <w:szCs w:val="19"/>
+              </w:rPr>
+              <w:t>r cos q₃ − e sin q₃); extra regressor column)</w:t>
             </w:r>
           </w:p>
         </w:tc>
@@ -8710,7 +9629,23 @@
                 <w:sz w:val="19"/>
                 <w:szCs w:val="19"/>
               </w:rPr>
-              <w:t>Convex, unique, no initial guess (Tafazoli [5])</w:t>
+              <w:t>Convex, unique, no initial guess (</w:t>
+            </w:r>
+            <w:proofErr w:type="spellStart"/>
+            <w:r>
+              <w:rPr>
+                <w:sz w:val="19"/>
+                <w:szCs w:val="19"/>
+              </w:rPr>
+              <w:t>Tafazoli</w:t>
+            </w:r>
+            <w:proofErr w:type="spellEnd"/>
+            <w:r>
+              <w:rPr>
+                <w:sz w:val="19"/>
+                <w:szCs w:val="19"/>
+              </w:rPr>
+              <w:t xml:space="preserve"> [5])</w:t>
             </w:r>
           </w:p>
         </w:tc>
@@ -8721,8 +9656,13 @@
         <w:pStyle w:val="Heading2"/>
       </w:pPr>
       <w:bookmarkStart w:id="28" w:name="_Toc235803532"/>
-      <w:r>
-        <w:t>B.2  Full parameter table</w:t>
+      <w:proofErr w:type="gramStart"/>
+      <w:r>
+        <w:t>B.2  Full</w:t>
+      </w:r>
+      <w:proofErr w:type="gramEnd"/>
+      <w:r>
+        <w:t xml:space="preserve"> parameter table</w:t>
       </w:r>
       <w:bookmarkEnd w:id="28"/>
     </w:p>
@@ -8732,7 +9672,23 @@
         <w:jc w:val="both"/>
       </w:pPr>
       <w:r>
-        <w:t>Complete Stage-1 parameter set with provenance and model status. Every value traces to Rasuli et al. [1], Table II (dynamic-identification case), receipted in claims.md.</w:t>
+        <w:t xml:space="preserve">Complete Stage-1 parameter set with provenance and model status. Every value </w:t>
+      </w:r>
+      <w:proofErr w:type="gramStart"/>
+      <w:r>
+        <w:t>traces</w:t>
+      </w:r>
+      <w:proofErr w:type="gramEnd"/>
+      <w:r>
+        <w:t xml:space="preserve"> to </w:t>
+      </w:r>
+      <w:proofErr w:type="spellStart"/>
+      <w:r>
+        <w:t>Rasuli</w:t>
+      </w:r>
+      <w:proofErr w:type="spellEnd"/>
+      <w:r>
+        <w:t xml:space="preserve"> et al. [1], Table II (dynamic-identification case), receipted in claims.md.</w:t>
       </w:r>
     </w:p>
     <w:tbl>
@@ -9032,6 +9988,7 @@
             </w:tcMar>
           </w:tcPr>
           <w:p>
+            <w:proofErr w:type="spellStart"/>
             <w:r>
               <w:rPr>
                 <w:sz w:val="19"/>
@@ -9047,6 +10004,7 @@
               </w:rPr>
               <w:t>COG_Offset</w:t>
             </w:r>
+            <w:proofErr w:type="spellEnd"/>
           </w:p>
         </w:tc>
         <w:tc>
@@ -9244,6 +10202,7 @@
             </w:tcMar>
           </w:tcPr>
           <w:p>
+            <w:proofErr w:type="spellStart"/>
             <w:r>
               <w:rPr>
                 <w:rFonts w:ascii="Cambria Math" w:eastAsia="Cambria Math" w:hAnsi="Cambria Math" w:cs="Cambria Math"/>
@@ -9265,6 +10224,7 @@
               </w:rPr>
               <w:t>zz</w:t>
             </w:r>
+            <w:proofErr w:type="spellEnd"/>
           </w:p>
         </w:tc>
         <w:tc>
@@ -9414,12 +10374,21 @@
             </w:tcMar>
           </w:tcPr>
           <w:p>
-            <w:r>
-              <w:rPr>
-                <w:sz w:val="19"/>
-                <w:szCs w:val="19"/>
-              </w:rPr>
-              <w:t>N·m·s/rad</w:t>
+            <w:proofErr w:type="spellStart"/>
+            <w:r>
+              <w:rPr>
+                <w:sz w:val="19"/>
+                <w:szCs w:val="19"/>
+              </w:rPr>
+              <w:t>N·m·s</w:t>
+            </w:r>
+            <w:proofErr w:type="spellEnd"/>
+            <w:r>
+              <w:rPr>
+                <w:sz w:val="19"/>
+                <w:szCs w:val="19"/>
+              </w:rPr>
+              <w:t>/rad</w:t>
             </w:r>
           </w:p>
         </w:tc>
@@ -9439,7 +10408,39 @@
                 <w:sz w:val="19"/>
                 <w:szCs w:val="19"/>
               </w:rPr>
-              <w:t>In model (dialog entry: 66.3225 N·m/(deg/s))</w:t>
+              <w:t xml:space="preserve">In model (dialog entry: 66.3225 </w:t>
+            </w:r>
+            <w:proofErr w:type="spellStart"/>
+            <w:r>
+              <w:rPr>
+                <w:sz w:val="19"/>
+                <w:szCs w:val="19"/>
+              </w:rPr>
+              <w:t>N·m</w:t>
+            </w:r>
+            <w:proofErr w:type="spellEnd"/>
+            <w:r>
+              <w:rPr>
+                <w:sz w:val="19"/>
+                <w:szCs w:val="19"/>
+              </w:rPr>
+              <w:t>/(</w:t>
+            </w:r>
+            <w:proofErr w:type="spellStart"/>
+            <w:r>
+              <w:rPr>
+                <w:sz w:val="19"/>
+                <w:szCs w:val="19"/>
+              </w:rPr>
+              <w:t>deg</w:t>
+            </w:r>
+            <w:proofErr w:type="spellEnd"/>
+            <w:r>
+              <w:rPr>
+                <w:sz w:val="19"/>
+                <w:szCs w:val="19"/>
+              </w:rPr>
+              <w:t>/s))</w:t>
             </w:r>
           </w:p>
         </w:tc>
@@ -9646,6 +10647,7 @@
             </w:tcMar>
           </w:tcPr>
           <w:p>
+            <w:proofErr w:type="spellStart"/>
             <w:r>
               <w:rPr>
                 <w:sz w:val="19"/>
@@ -9653,6 +10655,7 @@
               </w:rPr>
               <w:t>N·m</w:t>
             </w:r>
+            <w:proofErr w:type="spellEnd"/>
           </w:p>
         </w:tc>
         <w:tc>
@@ -9966,12 +10969,21 @@
             </w:tcMar>
           </w:tcPr>
           <w:p>
-            <w:r>
-              <w:rPr>
-                <w:sz w:val="19"/>
-                <w:szCs w:val="19"/>
-              </w:rPr>
-              <w:t>deg, rad/s</w:t>
+            <w:proofErr w:type="spellStart"/>
+            <w:r>
+              <w:rPr>
+                <w:sz w:val="19"/>
+                <w:szCs w:val="19"/>
+              </w:rPr>
+              <w:t>deg</w:t>
+            </w:r>
+            <w:proofErr w:type="spellEnd"/>
+            <w:r>
+              <w:rPr>
+                <w:sz w:val="19"/>
+                <w:szCs w:val="19"/>
+              </w:rPr>
+              <w:t>, rad/s</w:t>
             </w:r>
           </w:p>
         </w:tc>
@@ -10120,8 +11132,13 @@
         <w:pStyle w:val="Heading2"/>
       </w:pPr>
       <w:bookmarkStart w:id="29" w:name="_Toc235803533"/>
-      <w:r>
-        <w:t>B.3  Provenance and reproducibility</w:t>
+      <w:proofErr w:type="gramStart"/>
+      <w:r>
+        <w:t>B.3  Provenance</w:t>
+      </w:r>
+      <w:proofErr w:type="gramEnd"/>
+      <w:r>
+        <w:t xml:space="preserve"> and reproducibility</w:t>
       </w:r>
       <w:bookmarkEnd w:id="29"/>
     </w:p>
@@ -10131,7 +11148,45 @@
         <w:jc w:val="both"/>
       </w:pPr>
       <w:r>
-        <w:t>All artifacts are version-controlled in a private repository (github.com/sonu037/shovel_dynamics). The frozen evidence for this report is experiments/2026-07-07_stage1_final/: stage1_results.mat (complete run record — signals, estimates, covariances, condition numbers) plus five vector figures regenerable by scripts/make_stage1_figures.m. The model is model/ShovelSimulator.slx with its CHANGELOG; parameters live solely in scripts/shovel_params.m; the analysis is scripts/validate_and_identify.m, whose header documents nine audited fixes (G1–G9). Numerical claims are receipted in claims.md; the day-by-day narrative — including all defect investigations of Section 3.2 and both provenance incidents of Section 4.3 — is research_log.md. Any figure or number in this report can be regenerated from the repository at the commit tagged for this release.</w:t>
+        <w:t>All artifacts are version-controlled in a private repository (github.com/sonu037/</w:t>
+      </w:r>
+      <w:proofErr w:type="spellStart"/>
+      <w:r>
+        <w:t>shovel_dynamics</w:t>
+      </w:r>
+      <w:proofErr w:type="spellEnd"/>
+      <w:r>
+        <w:t>). The frozen evidence for this report is experiments/2026-07-07_stage1_final/: stage1_results.mat (complete run record — signals, estimates, covariances, condition numbers) plus five vector figures regenerable by scripts/make_stage1_figures.m. The model is model/</w:t>
+      </w:r>
+      <w:proofErr w:type="spellStart"/>
+      <w:r>
+        <w:t>ShovelSimulator.slx</w:t>
+      </w:r>
+      <w:proofErr w:type="spellEnd"/>
+      <w:r>
+        <w:t xml:space="preserve"> with its CHANGELOG; parameters live solely in scripts/</w:t>
+      </w:r>
+      <w:proofErr w:type="spellStart"/>
+      <w:r>
+        <w:t>shovel</w:t>
+      </w:r>
+      <w:r>
+        <w:t>_</w:t>
+      </w:r>
+      <w:r>
+        <w:t>params.m</w:t>
+      </w:r>
+      <w:proofErr w:type="spellEnd"/>
+      <w:r>
+        <w:t>; the analysis is scripts/</w:t>
+      </w:r>
+      <w:proofErr w:type="spellStart"/>
+      <w:r>
+        <w:t>validate_and_identify.m</w:t>
+      </w:r>
+      <w:proofErr w:type="spellEnd"/>
+      <w:r>
+        <w:t>, whose header documents nine audited fixes (G1–G9). Numerical claims are receipted in claims.md; the day-by-day narrative — including all defect investigations of Section 3.2 and both provenance incidents of Section 4.3 — is research_log.md. Any figure or number in this report can be regenerated from the repository at the commit tagged for this release.</w:t>
       </w:r>
     </w:p>
     <w:sectPr>

</xml_diff>